<commit_message>
Corrige Documento 04 (DoD): Historia 003 y 005 ahora reflejan umbral y medicion por circuito
</commit_message>
<xml_diff>
--- a/docs/Fase 2/Evidencias Proyecto (Version Agil)/Documento 04 - Definition of Done.docx
+++ b/docs/Fase 2/Evidencias Proyecto (Version Agil)/Documento 04 - Definition of Done.docx
@@ -31,7 +31,7 @@
             <w:tblLook w:val="04A0" w:firstRow="1" w:lastRow="0" w:firstColumn="1" w:lastColumn="0" w:noHBand="0" w:noVBand="1"/>
           </w:tblPr>
           <w:tblGrid>
-            <w:gridCol w:w="9054"/>
+            <w:gridCol w:w="8838"/>
           </w:tblGrid>
           <w:tr>
             <w:trPr>
@@ -332,7 +332,7 @@
             <w:tblLook w:val="04A0" w:firstRow="1" w:lastRow="0" w:firstColumn="1" w:lastColumn="0" w:noHBand="0" w:noVBand="1"/>
           </w:tblPr>
           <w:tblGrid>
-            <w:gridCol w:w="9054"/>
+            <w:gridCol w:w="8838"/>
           </w:tblGrid>
           <w:tr>
             <w:sdt>
@@ -3075,7 +3075,7 @@
         <w:rPr>
           <w:lang w:val="es-ES" w:eastAsia="es-ES"/>
         </w:rPr>
-        <w:t>El sistema debe asociar cada medición al tablero correspondiente.</w:t>
+        <w:t>El sistema debe asociar cada medición al circuito correspondiente (y, a través de este, al tablero y dispositivo que la generaron).</w:t>
       </w:r>
     </w:p>
     <w:p>
@@ -3472,7 +3472,7 @@
         <w:rPr>
           <w:lang w:val="es-ES" w:eastAsia="es-ES"/>
         </w:rPr>
-        <w:t>El sistema debe comparar cada medición recibida contra el umbral configurado para el tablero.</w:t>
+        <w:t>El sistema debe comparar cada medición recibida contra el umbral configurado al nivel que corresponde a la variable (circuito para corriente, voltaje y potencia; tablero para temperatura).</w:t>
       </w:r>
     </w:p>
     <w:p>
@@ -3544,7 +3544,7 @@
         <w:rPr>
           <w:lang w:val="es-ES" w:eastAsia="es-ES"/>
         </w:rPr>
-        <w:t>El sistema debe permitir configurar el valor del umbral de forma independiente para cada tablero.</w:t>
+        <w:t>El sistema debe permitir configurar el valor del umbral de forma independiente para cada circuito (corriente, voltaje, potencia) o para cada tablero (temperatura), según corresponda.</w:t>
       </w:r>
     </w:p>
     <w:p>
@@ -3588,6 +3588,7 @@
         <w:rPr>
           <w:lang w:val="es-ES" w:eastAsia="es-ES"/>
         </w:rPr>
+        <w:lastRenderedPageBreak/>
         <w:t>El código del motor de comparación y generación de alertas se encuentra subido a GitHub y con su validación de pares.</w:t>
       </w:r>
     </w:p>
@@ -3624,7 +3625,6 @@
         <w:rPr>
           <w:lang w:val="es-ES" w:eastAsia="es-ES"/>
         </w:rPr>
-        <w:lastRenderedPageBreak/>
         <w:t>El mecanismo de generación de alertas fue probado con casos límite del umbral configurado.</w:t>
       </w:r>
     </w:p>
@@ -3967,6 +3967,7 @@
         <w:pStyle w:val="Ttulo3"/>
       </w:pPr>
       <w:r>
+        <w:lastRenderedPageBreak/>
         <w:t>DoD Técnico</w:t>
       </w:r>
     </w:p>
@@ -4003,7 +4004,6 @@
         <w:rPr>
           <w:lang w:val="es-ES" w:eastAsia="es-ES"/>
         </w:rPr>
-        <w:lastRenderedPageBreak/>
         <w:t>El código de validación de acceso se encuentra subido a GitHub y con su validación de pares.</w:t>
       </w:r>
     </w:p>
@@ -4338,6 +4338,7 @@
         <w:rPr>
           <w:lang w:val="es-ES" w:eastAsia="es-ES"/>
         </w:rPr>
+        <w:lastRenderedPageBreak/>
         <w:t>El sistema debe generar una alerta visible cuando la temperatura registrada supere el umbral configurado.</w:t>
       </w:r>
     </w:p>
@@ -4356,7 +4357,6 @@
         <w:rPr>
           <w:lang w:val="es-ES" w:eastAsia="es-ES"/>
         </w:rPr>
-        <w:lastRenderedPageBreak/>
         <w:t>El sistema no debe omitir el registro de temperatura cuando el sensor se encuentre disponible.</w:t>
       </w:r>
     </w:p>
@@ -8106,6 +8106,7 @@
     <w:rsid w:val="00252686"/>
     <w:rsid w:val="002835FC"/>
     <w:rsid w:val="002C06A7"/>
+    <w:rsid w:val="0049500C"/>
     <w:rsid w:val="004F7F49"/>
     <w:rsid w:val="0057410B"/>
     <w:rsid w:val="00592893"/>
@@ -8119,7 +8120,6 @@
     <w:rsid w:val="00960213"/>
     <w:rsid w:val="009B18C0"/>
     <w:rsid w:val="00BD2436"/>
-    <w:rsid w:val="00BF2317"/>
     <w:rsid w:val="00C47BA2"/>
     <w:rsid w:val="00C5036F"/>
     <w:rsid w:val="00C861E5"/>
@@ -8128,7 +8128,7 @@
     <w:rsid w:val="00EC21D5"/>
     <w:rsid w:val="00F03101"/>
     <w:rsid w:val="00F0486C"/>
-    <w:rsid w:val="00F34321"/>
+    <w:rsid w:val="00F74A47"/>
   </w:rsids>
   <m:mathPr>
     <m:mathFont m:val="Cambria Math"/>

</xml_diff>